<commit_message>
Edited the New Features Document
</commit_message>
<xml_diff>
--- a/Additional Features for Warehouse Program.docx
+++ b/Additional Features for Warehouse Program.docx
@@ -411,6 +411,65 @@
       <w:r>
         <w:t>TRANSFER FORM</w:t>
       </w:r>
+    </w:p>
+    <w:p>
+      <w:pPr>
+        <w:pStyle w:val="ListParagraph"/>
+        <w:numPr>
+          <w:ilvl w:val="0"/>
+          <w:numId w:val="1"/>
+        </w:numPr>
+        <w:rPr>
+          <w:b/>
+          <w:bCs/>
+        </w:rPr>
+      </w:pPr>
+      <w:r>
+        <w:rPr>
+          <w:b/>
+          <w:bCs/>
+        </w:rPr>
+        <w:t>CREATION OF NEW RM CODE IF NOT EXISTED WHEN UPLOADING BEGINNING SOH</w:t>
+      </w:r>
+    </w:p>
+    <w:p>
+      <w:pPr>
+        <w:pStyle w:val="ListParagraph"/>
+      </w:pPr>
+      <w:r>
+        <w:t xml:space="preserve">When the user uploaded a new beginning SOH and the Raw Material Code that are in that Beginning SOH are not existing in the database, the program should automatically create that RM code in the </w:t>
+      </w:r>
+      <w:proofErr w:type="spellStart"/>
+      <w:r>
+        <w:t>tbl_raw_materials</w:t>
+      </w:r>
+      <w:proofErr w:type="spellEnd"/>
+      <w:r>
+        <w:t xml:space="preserve"> table and also create a record in the </w:t>
+      </w:r>
+      <w:proofErr w:type="spellStart"/>
+      <w:r>
+        <w:t>tbl_stock_on_hand</w:t>
+      </w:r>
+      <w:proofErr w:type="spellEnd"/>
+      <w:r>
+        <w:t xml:space="preserve"> table.</w:t>
+      </w:r>
+    </w:p>
+    <w:p>
+      <w:pPr>
+        <w:pStyle w:val="ListParagraph"/>
+      </w:pPr>
+    </w:p>
+    <w:p>
+      <w:pPr>
+        <w:pStyle w:val="ListParagraph"/>
+      </w:pPr>
+    </w:p>
+    <w:p>
+      <w:pPr>
+        <w:pStyle w:val="ListParagraph"/>
+      </w:pPr>
     </w:p>
     <w:sectPr>
       <w:pgSz w:w="12240" w:h="15840"/>

</xml_diff>